<commit_message>
fix(usp71): update all SOP references to MICRO-SOP-5 and MICRO SOP-9, rectify docx templates and code
</commit_message>
<xml_diff>
--- a/USP71 OOS P1 template 0.docx
+++ b/USP71 OOS P1 template 0.docx
@@ -1593,12 +1593,6 @@
               </w:rPr>
             </w:pPr>
             <w:r>
-              <w:rPr>
-                <w:rFonts w:ascii="Times New Roman" w:hAnsi="Times New Roman"/>
-                <w:bCs/>
-                <w:sz w:val="22"/>
-                <w:szCs w:val="22"/>
-              </w:rPr>
               <w:t>SOP / Test Method #:</w:t>
             </w:r>
           </w:p>
@@ -1613,22 +1607,7 @@
               </w:rPr>
             </w:pPr>
             <w:r>
-              <w:rPr>
-                <w:rFonts w:ascii="Times New Roman" w:hAnsi="Times New Roman"/>
-                <w:bCs/>
-                <w:sz w:val="22"/>
-                <w:szCs w:val="22"/>
-              </w:rPr>
-              <w:t>2.600.059</w:t>
-            </w:r>
-            <w:r>
-              <w:rPr>
-                <w:rFonts w:ascii="Times New Roman" w:hAnsi="Times New Roman"/>
-                <w:bCs/>
-                <w:sz w:val="22"/>
-                <w:szCs w:val="22"/>
-              </w:rPr>
-              <w:t xml:space="preserve"> (01)</w:t>
+              <w:t>MICRO-SOP-5 (19)</w:t>
             </w:r>
           </w:p>
         </w:tc>
@@ -1648,12 +1627,6 @@
               </w:rPr>
             </w:pPr>
             <w:r>
-              <w:rPr>
-                <w:rFonts w:ascii="Times New Roman" w:hAnsi="Times New Roman"/>
-                <w:bCs/>
-                <w:sz w:val="22"/>
-                <w:szCs w:val="22"/>
-              </w:rPr>
               <w:t xml:space="preserve">Effective Date: </w:t>
             </w:r>
           </w:p>
@@ -1668,13 +1641,7 @@
               </w:rPr>
             </w:pPr>
             <w:r>
-              <w:rPr>
-                <w:rFonts w:ascii="Times New Roman" w:hAnsi="Times New Roman"/>
-                <w:bCs/>
-                <w:sz w:val="22"/>
-                <w:szCs w:val="22"/>
-              </w:rPr>
-              <w:t>03Jan25</w:t>
+              <w:t>24Jul26</w:t>
             </w:r>
           </w:p>
         </w:tc>
@@ -1695,6 +1662,12 @@
               </w:rPr>
             </w:pPr>
             <w:r>
+              <w:t>SOP / Test Method Rev:</w:t>
+            </w:r>
+          </w:p>
+          <w:p>
+            <w:pPr>
+              <w:outlineLvl w:val="0"/>
               <w:rPr>
                 <w:rFonts w:ascii="Times New Roman" w:hAnsi="Times New Roman"/>
                 <w:bCs/>
@@ -1702,49 +1675,9 @@
                 <w:sz w:val="22"/>
                 <w:szCs w:val="22"/>
               </w:rPr>
-              <w:t>SOP / Test</w:t>
-            </w:r>
-            <w:r>
-              <w:rPr>
-                <w:rFonts w:ascii="Times New Roman" w:hAnsi="Times New Roman"/>
-                <w:bCs/>
-                <w:noProof/>
-                <w:sz w:val="22"/>
-                <w:szCs w:val="22"/>
-              </w:rPr>
-              <w:t>:</w:t>
-            </w:r>
-          </w:p>
-          <w:p>
-            <w:pPr>
-              <w:outlineLvl w:val="0"/>
-              <w:rPr>
-                <w:rFonts w:ascii="Times New Roman" w:hAnsi="Times New Roman"/>
-                <w:bCs/>
-                <w:noProof/>
-                <w:sz w:val="22"/>
-                <w:szCs w:val="22"/>
-              </w:rPr>
-            </w:pPr>
-            <w:r>
-              <w:rPr>
-                <w:rFonts w:ascii="Times New Roman" w:hAnsi="Times New Roman"/>
-                <w:bCs/>
-                <w:noProof/>
-                <w:sz w:val="22"/>
-                <w:szCs w:val="22"/>
-              </w:rPr>
-              <w:t>Rev: 0</w:t>
-            </w:r>
-            <w:r>
-              <w:rPr>
-                <w:rFonts w:ascii="Times New Roman" w:hAnsi="Times New Roman"/>
-                <w:bCs/>
-                <w:noProof/>
-                <w:sz w:val="22"/>
-                <w:szCs w:val="22"/>
-              </w:rPr>
-              <w:t>1</w:t>
+            </w:pPr>
+            <w:r>
+              <w:t>Rev: 19</w:t>
             </w:r>
           </w:p>
         </w:tc>
@@ -1764,12 +1697,6 @@
               </w:rPr>
             </w:pPr>
             <w:r>
-              <w:rPr>
-                <w:rFonts w:ascii="Times New Roman" w:hAnsi="Times New Roman"/>
-                <w:bCs/>
-                <w:sz w:val="22"/>
-                <w:szCs w:val="22"/>
-              </w:rPr>
               <w:t>Limits/Specification:</w:t>
             </w:r>
           </w:p>
@@ -1784,13 +1711,7 @@
               </w:rPr>
             </w:pPr>
             <w:r>
-              <w:rPr>
-                <w:rFonts w:ascii="Times New Roman" w:hAnsi="Times New Roman"/>
-                <w:bCs/>
-                <w:sz w:val="22"/>
-                <w:szCs w:val="22"/>
-              </w:rPr>
-              <w:t>&lt;1 event</w:t>
+              <w:t>Pass/Fail</w:t>
             </w:r>
           </w:p>
         </w:tc>
@@ -3173,36 +3094,7 @@
               </w:rPr>
             </w:pPr>
             <w:r>
-              <w:rPr>
-                <w:rFonts w:ascii="Times New Roman" w:hAnsi="Times New Roman"/>
-                <w:sz w:val="22"/>
-                <w:szCs w:val="22"/>
-              </w:rPr>
-              <w:t>Yes, as per SOP</w:t>
-            </w:r>
-            <w:r>
-              <w:rPr>
-                <w:rFonts w:ascii="Times New Roman" w:hAnsi="Times New Roman"/>
-                <w:sz w:val="22"/>
-                <w:szCs w:val="22"/>
-              </w:rPr>
-              <w:t>#</w:t>
-            </w:r>
-            <w:r>
-              <w:rPr>
-                <w:rFonts w:ascii="Times New Roman" w:hAnsi="Times New Roman"/>
-                <w:sz w:val="22"/>
-                <w:szCs w:val="22"/>
-              </w:rPr>
-              <w:t xml:space="preserve"> </w:t>
-            </w:r>
-            <w:r>
-              <w:rPr>
-                <w:rFonts w:ascii="Times New Roman" w:hAnsi="Times New Roman"/>
-                <w:sz w:val="22"/>
-                <w:szCs w:val="22"/>
-              </w:rPr>
-              <w:t>2.600.059</w:t>
+              <w:t>Yes, as per MICRO-SOP-5</w:t>
             </w:r>
           </w:p>
         </w:tc>
@@ -3453,36 +3345,7 @@
               </w:rPr>
             </w:pPr>
             <w:r>
-              <w:rPr>
-                <w:rFonts w:ascii="Times New Roman" w:hAnsi="Times New Roman"/>
-                <w:sz w:val="22"/>
-                <w:szCs w:val="22"/>
-              </w:rPr>
-              <w:t>Yes, as per SOP</w:t>
-            </w:r>
-            <w:r>
-              <w:rPr>
-                <w:rFonts w:ascii="Times New Roman" w:hAnsi="Times New Roman"/>
-                <w:sz w:val="22"/>
-                <w:szCs w:val="22"/>
-              </w:rPr>
-              <w:t>#</w:t>
-            </w:r>
-            <w:r>
-              <w:rPr>
-                <w:rFonts w:ascii="Times New Roman" w:hAnsi="Times New Roman"/>
-                <w:sz w:val="22"/>
-                <w:szCs w:val="22"/>
-              </w:rPr>
-              <w:t xml:space="preserve"> </w:t>
-            </w:r>
-            <w:r>
-              <w:rPr>
-                <w:rFonts w:ascii="Times New Roman" w:hAnsi="Times New Roman"/>
-                <w:sz w:val="22"/>
-                <w:szCs w:val="22"/>
-              </w:rPr>
-              <w:t>2.600.059</w:t>
+              <w:t>Yes, as per MICRO-SOP-5</w:t>
             </w:r>
           </w:p>
         </w:tc>
@@ -10971,6 +10834,12 @@
               </w:rPr>
             </w:pPr>
             <w:r>
+              <w:t xml:space="preserve">Once transferred into the ISO 5 BSC, the vials were placed on the disinfected working surface of the BSC E00{{bsc_id}} and aseptically opened and tested in accordance with MICRO-SOP-5 (USP &lt;71&gt; / EP 2.6.1 Sterility Test). Following testing, the media bottles were subsequently transferred into designated incubators, E001356 and E001357, to initiate incubation. </w:t>
+            </w:r>
+          </w:p>
+          <w:p>
+            <w:pPr>
+              <w:outlineLvl w:val="0"/>
               <w:rPr>
                 <w:rFonts w:ascii="Times New Roman" w:eastAsiaTheme="minorEastAsia" w:hAnsi="Times New Roman"/>
                 <w:bCs/>
@@ -10978,8 +10847,7 @@
                 <w:szCs w:val="22"/>
                 <w:lang w:eastAsia="zh-CN"/>
               </w:rPr>
-              <w:t xml:space="preserve">Once transferred into the ISO 5 BSC, the vials were placed on the disinfected working surface of the BSC E00{{bsc_id}} and aseptically opened and tested in accordance with SOP 2.600.008 (USP / EP 2.6.1 Sterility Test). Following testing, the media bottles were subsequently transferred into designated incubators, E001356 and E001357, to initiate incubation. </w:t>
-            </w:r>
+            </w:pPr>
           </w:p>
           <w:p>
             <w:pPr>
@@ -10992,10 +10860,7 @@
                 <w:lang w:eastAsia="zh-CN"/>
               </w:rPr>
             </w:pPr>
-          </w:p>
-          <w:p>
-            <w:pPr>
-              <w:outlineLvl w:val="0"/>
+            <w:r>
               <w:rPr>
                 <w:rFonts w:ascii="Times New Roman" w:eastAsiaTheme="minorEastAsia" w:hAnsi="Times New Roman"/>
                 <w:bCs/>
@@ -11003,8 +10868,12 @@
                 <w:szCs w:val="22"/>
                 <w:lang w:eastAsia="zh-CN"/>
               </w:rPr>
-            </w:pPr>
-            <w:r>
+              <w:t>On {{ test_date }} (Day {{incubation_time}} of incubation), microbial growth was observed in {{ positive_media}} media bottle by analyst {{ reading_name }} and confirmed by Microbiology Lab Supervisor Robin Seymour. The organism was identified as {{ positive_org }} (see Table 1).</w:t>
+            </w:r>
+          </w:p>
+          <w:p>
+            <w:pPr>
+              <w:outlineLvl w:val="0"/>
               <w:rPr>
                 <w:rFonts w:ascii="Times New Roman" w:eastAsiaTheme="minorEastAsia" w:hAnsi="Times New Roman"/>
                 <w:bCs/>
@@ -11012,12 +10881,8 @@
                 <w:szCs w:val="22"/>
                 <w:lang w:eastAsia="zh-CN"/>
               </w:rPr>
-              <w:t>On {{ test_date }} (Day {{incubation_time}} of incubation), microbial growth was observed in {{ positive_media}} media bottle by analyst {{ reading_name }} and confirmed by Microbiology Lab Supervisor Robin Seymour. The organism was identified as {{ positive_org }} (see Table 1).</w:t>
-            </w:r>
-          </w:p>
-          <w:p>
-            <w:pPr>
-              <w:outlineLvl w:val="0"/>
+            </w:pPr>
+            <w:r>
               <w:rPr>
                 <w:rFonts w:ascii="Times New Roman" w:eastAsiaTheme="minorEastAsia" w:hAnsi="Times New Roman"/>
                 <w:bCs/>
@@ -11025,8 +10890,12 @@
                 <w:szCs w:val="22"/>
                 <w:lang w:eastAsia="zh-CN"/>
               </w:rPr>
-            </w:pPr>
-            <w:r>
+              <w:t xml:space="preserve"> </w:t>
+            </w:r>
+          </w:p>
+          <w:p>
+            <w:pPr>
+              <w:outlineLvl w:val="0"/>
               <w:rPr>
                 <w:rFonts w:ascii="Times New Roman" w:eastAsiaTheme="minorEastAsia" w:hAnsi="Times New Roman"/>
                 <w:bCs/>
@@ -11034,12 +10903,8 @@
                 <w:szCs w:val="22"/>
                 <w:lang w:eastAsia="zh-CN"/>
               </w:rPr>
-              <w:t xml:space="preserve"> </w:t>
-            </w:r>
-          </w:p>
-          <w:p>
-            <w:pPr>
-              <w:outlineLvl w:val="0"/>
+            </w:pPr>
+            <w:r>
               <w:rPr>
                 <w:rFonts w:ascii="Times New Roman" w:eastAsiaTheme="minorEastAsia" w:hAnsi="Times New Roman"/>
                 <w:bCs/>
@@ -11047,8 +10912,12 @@
                 <w:szCs w:val="22"/>
                 <w:lang w:eastAsia="zh-CN"/>
               </w:rPr>
-            </w:pPr>
-            <w:r>
+              <w:t>The culture media used were within expiry. Negative control media bottles were processed and incubated under identical conditions and showed no microbial growth, confirming the integrity of the test procedure.</w:t>
+            </w:r>
+          </w:p>
+          <w:p>
+            <w:pPr>
+              <w:outlineLvl w:val="0"/>
               <w:rPr>
                 <w:rFonts w:ascii="Times New Roman" w:eastAsiaTheme="minorEastAsia" w:hAnsi="Times New Roman"/>
                 <w:bCs/>
@@ -11056,8 +10925,7 @@
                 <w:szCs w:val="22"/>
                 <w:lang w:eastAsia="zh-CN"/>
               </w:rPr>
-              <w:t>The culture media used were within expiry. Negative control media bottles were processed and incubated under identical conditions and showed no microbial growth, confirming the integrity of the test procedure.</w:t>
-            </w:r>
+            </w:pPr>
           </w:p>
           <w:p>
             <w:pPr>
@@ -11070,10 +10938,7 @@
                 <w:lang w:eastAsia="zh-CN"/>
               </w:rPr>
             </w:pPr>
-          </w:p>
-          <w:p>
-            <w:pPr>
-              <w:outlineLvl w:val="0"/>
+            <w:r>
               <w:rPr>
                 <w:rFonts w:ascii="Times New Roman" w:eastAsiaTheme="minorEastAsia" w:hAnsi="Times New Roman"/>
                 <w:bCs/>
@@ -11081,8 +10946,12 @@
                 <w:szCs w:val="22"/>
                 <w:lang w:eastAsia="zh-CN"/>
               </w:rPr>
-            </w:pPr>
-            <w:r>
+              <w:t xml:space="preserve">{{ narrative_summary }} </w:t>
+            </w:r>
+          </w:p>
+          <w:p>
+            <w:pPr>
+              <w:outlineLvl w:val="0"/>
               <w:rPr>
                 <w:rFonts w:ascii="Times New Roman" w:eastAsiaTheme="minorEastAsia" w:hAnsi="Times New Roman"/>
                 <w:bCs/>
@@ -11090,8 +10959,7 @@
                 <w:szCs w:val="22"/>
                 <w:lang w:eastAsia="zh-CN"/>
               </w:rPr>
-              <w:t xml:space="preserve">{{ narrative_summary }} </w:t>
-            </w:r>
+            </w:pPr>
           </w:p>
           <w:p>
             <w:pPr>
@@ -11104,6 +10972,9 @@
                 <w:lang w:eastAsia="zh-CN"/>
               </w:rPr>
             </w:pPr>
+            <w:r>
+              <w:t xml:space="preserve">The analysts confirmed full compliance with cleaning procedures as outlined in MICRO SOP-9 (Cleaning and Disinfecting Procedure for Microbiology) and MICRO-SOP-5 (USP &lt;71&gt; / EP 2.6.1 Sterility Test). </w:t>
+            </w:r>
           </w:p>
           <w:p>
             <w:pPr>
@@ -11116,7 +10987,10 @@
                 <w:lang w:eastAsia="zh-CN"/>
               </w:rPr>
             </w:pPr>
-            <w:r>
+          </w:p>
+          <w:p>
+            <w:pPr>
+              <w:outlineLvl w:val="0"/>
               <w:rPr>
                 <w:rFonts w:ascii="Times New Roman" w:eastAsiaTheme="minorEastAsia" w:hAnsi="Times New Roman"/>
                 <w:bCs/>
@@ -11124,52 +10998,9 @@
                 <w:szCs w:val="22"/>
                 <w:lang w:eastAsia="zh-CN"/>
               </w:rPr>
-              <w:t xml:space="preserve">The analysts confirmed full compliance with cleaning procedures as outlined in SOPs 2.600.018 (Cleaning and Disinfecting Procedure for Microbiology) and 2.600.008 (USP &lt;71&gt; / EP 2.6.1 Sterility Test). </w:t>
-            </w:r>
-          </w:p>
-          <w:p>
-            <w:pPr>
-              <w:outlineLvl w:val="0"/>
-              <w:rPr>
-                <w:rFonts w:ascii="Times New Roman" w:eastAsiaTheme="minorEastAsia" w:hAnsi="Times New Roman"/>
-                <w:bCs/>
-                <w:sz w:val="22"/>
-                <w:szCs w:val="22"/>
-                <w:lang w:eastAsia="zh-CN"/>
-              </w:rPr>
-            </w:pPr>
-          </w:p>
-          <w:p>
-            <w:pPr>
-              <w:outlineLvl w:val="0"/>
-              <w:rPr>
-                <w:rFonts w:ascii="Times New Roman" w:eastAsiaTheme="minorEastAsia" w:hAnsi="Times New Roman"/>
-                <w:bCs/>
-                <w:sz w:val="22"/>
-                <w:szCs w:val="22"/>
-                <w:lang w:eastAsia="zh-CN"/>
-              </w:rPr>
-            </w:pPr>
-            <w:r>
-              <w:rPr>
-                <w:rFonts w:ascii="Times New Roman" w:eastAsiaTheme="minorEastAsia" w:hAnsi="Times New Roman"/>
-                <w:bCs/>
-                <w:sz w:val="22"/>
-                <w:szCs w:val="22"/>
-                <w:lang w:eastAsia="zh-CN"/>
-              </w:rPr>
-              <w:t xml:space="preserve">Monthly cleaning and disinfection of the outermost ISO 8 Anteroom, the middle ISO 7 Buffer room, the innermost ISO 7 cleanroom, and its containing ISO 5 Biosafety Cabinets for CR {{ cr_suit }} was performed on {{ monthly_cleaning_date }}, as per SOP 2.600.018 (Cleaning and Disinfecting Procedure for Microbiology) During </w:t>
-            </w:r>
-            <w:r>
-              <w:rPr>
-                <w:rFonts w:ascii="Times New Roman" w:eastAsiaTheme="minorEastAsia" w:hAnsi="Times New Roman"/>
-                <w:bCs/>
-                <w:sz w:val="22"/>
-                <w:szCs w:val="22"/>
-                <w:lang w:eastAsia="zh-CN"/>
-              </w:rPr>
-              <w:lastRenderedPageBreak/>
-              <w:t xml:space="preserve">both cleaning cycles, it was documented that all H₂O₂ indicators passed. This confirms the efficient monthly cleaning of all three parts of Cleanrooms {{ cr_suit }}. </w:t>
+            </w:pPr>
+            <w:r>
+              <w:t xml:space="preserve">Monthly cleaning and disinfection of the outermost ISO 8 Anteroom, the middle ISO 7 Buffer room, the innermost ISO 7 cleanroom, and its containing ISO 5 Biosafety Cabinets for CR {{ cr_suit }} was performed on {{ monthly_cleaning_date }}, as per MICRO SOP-9 (Cleaning and Disinfecting Procedure for Microbiology) During both cleaning cycles, it was documented that all H₂O₂ indicators passed. This confirms the efficient monthly cleaning of all three parts of Cleanrooms {{ cr_suit }}. </w:t>
             </w:r>
           </w:p>
           <w:p>
@@ -12363,41 +12194,8 @@
             <w:vAlign w:val="center"/>
           </w:tcPr>
           <w:p>
-            <w:pPr>
-              <w:pStyle w:val="Default"/>
-              <w:jc w:val="center"/>
-              <w:rPr>
-                <w:bCs/>
-                <w:sz w:val="14"/>
-                <w:szCs w:val="14"/>
-              </w:rPr>
-            </w:pPr>
-          </w:p>
-          <w:p>
-            <w:pPr>
-              <w:pStyle w:val="Default"/>
-              <w:jc w:val="center"/>
-              <w:rPr>
-                <w:bCs/>
-                <w:sz w:val="14"/>
-                <w:szCs w:val="14"/>
-              </w:rPr>
-            </w:pPr>
-            <w:r>
-              <w:rPr>
-                <w:bCs/>
-                <w:sz w:val="14"/>
-                <w:szCs w:val="14"/>
-              </w:rPr>
-              <w:t>Processing</w:t>
-            </w:r>
-            <w:r>
-              <w:rPr>
-                <w:bCs/>
-                <w:sz w:val="14"/>
-                <w:szCs w:val="14"/>
-              </w:rPr>
-              <w:t xml:space="preserve"> Analyst</w:t>
+            <w:r>
+              <w:t>Processing Analyst</w:t>
             </w:r>
           </w:p>
         </w:tc>
@@ -12407,43 +12205,8 @@
             <w:shd w:val="clear" w:color="auto" w:fill="EEECE1" w:themeFill="background2"/>
           </w:tcPr>
           <w:p>
-            <w:pPr>
-              <w:pStyle w:val="Default"/>
-              <w:jc w:val="center"/>
-              <w:rPr>
-                <w:bCs/>
-                <w:sz w:val="14"/>
-                <w:szCs w:val="14"/>
-              </w:rPr>
-            </w:pPr>
-          </w:p>
-          <w:p>
-            <w:pPr>
-              <w:pStyle w:val="Default"/>
-              <w:jc w:val="center"/>
-              <w:rPr>
-                <w:bCs/>
-                <w:sz w:val="14"/>
-                <w:szCs w:val="14"/>
-              </w:rPr>
-            </w:pPr>
-            <w:r>
-              <w:rPr>
-                <w:rFonts w:eastAsiaTheme="minorEastAsia" w:hint="eastAsia"/>
-                <w:bCs/>
-                <w:sz w:val="14"/>
-                <w:szCs w:val="14"/>
-                <w:lang w:eastAsia="zh-CN"/>
-              </w:rPr>
-              <w:t>Aliquoting</w:t>
-            </w:r>
-            <w:r>
-              <w:rPr>
-                <w:bCs/>
-                <w:sz w:val="14"/>
-                <w:szCs w:val="14"/>
-              </w:rPr>
-              <w:t xml:space="preserve"> Analyst</w:t>
+            <w:r>
+              <w:t>Reading Analyst</w:t>
             </w:r>
           </w:p>
         </w:tc>
@@ -12454,32 +12217,7 @@
             <w:vAlign w:val="center"/>
           </w:tcPr>
           <w:p>
-            <w:pPr>
-              <w:pStyle w:val="Default"/>
-              <w:jc w:val="center"/>
-              <w:rPr>
-                <w:bCs/>
-                <w:sz w:val="14"/>
-                <w:szCs w:val="14"/>
-              </w:rPr>
-            </w:pPr>
-          </w:p>
-          <w:p>
-            <w:pPr>
-              <w:pStyle w:val="Default"/>
-              <w:jc w:val="center"/>
-              <w:rPr>
-                <w:bCs/>
-                <w:sz w:val="14"/>
-                <w:szCs w:val="14"/>
-              </w:rPr>
-            </w:pPr>
-            <w:r>
-              <w:rPr>
-                <w:bCs/>
-                <w:sz w:val="14"/>
-                <w:szCs w:val="14"/>
-              </w:rPr>
+            <w:r>
               <w:t>Sample ID</w:t>
             </w:r>
           </w:p>
@@ -12491,32 +12229,7 @@
             <w:vAlign w:val="center"/>
           </w:tcPr>
           <w:p>
-            <w:pPr>
-              <w:pStyle w:val="Default"/>
-              <w:jc w:val="center"/>
-              <w:rPr>
-                <w:bCs/>
-                <w:sz w:val="14"/>
-                <w:szCs w:val="14"/>
-              </w:rPr>
-            </w:pPr>
-          </w:p>
-          <w:p>
-            <w:pPr>
-              <w:pStyle w:val="Default"/>
-              <w:jc w:val="center"/>
-              <w:rPr>
-                <w:bCs/>
-                <w:sz w:val="14"/>
-                <w:szCs w:val="14"/>
-              </w:rPr>
-            </w:pPr>
-            <w:r>
-              <w:rPr>
-                <w:bCs/>
-                <w:sz w:val="14"/>
-                <w:szCs w:val="14"/>
-              </w:rPr>
+            <w:r>
               <w:t>Related Microbial ID</w:t>
             </w:r>
           </w:p>
@@ -12528,33 +12241,8 @@
             <w:vAlign w:val="center"/>
           </w:tcPr>
           <w:p>
-            <w:pPr>
-              <w:pStyle w:val="Default"/>
-              <w:jc w:val="center"/>
-              <w:rPr>
-                <w:bCs/>
-                <w:sz w:val="14"/>
-                <w:szCs w:val="14"/>
-              </w:rPr>
-            </w:pPr>
-          </w:p>
-          <w:p>
-            <w:pPr>
-              <w:pStyle w:val="Default"/>
-              <w:jc w:val="center"/>
-              <w:rPr>
-                <w:bCs/>
-                <w:sz w:val="14"/>
-                <w:szCs w:val="14"/>
-              </w:rPr>
-            </w:pPr>
-            <w:r>
-              <w:rPr>
-                <w:bCs/>
-                <w:sz w:val="14"/>
-                <w:szCs w:val="14"/>
-              </w:rPr>
-              <w:t>Media with microbial growth</w:t>
+            <w:r>
+              <w:t>Media with Microbial growth</w:t>
             </w:r>
           </w:p>
         </w:tc>
@@ -12565,33 +12253,8 @@
             <w:vAlign w:val="center"/>
           </w:tcPr>
           <w:p>
-            <w:pPr>
-              <w:pStyle w:val="Default"/>
-              <w:jc w:val="center"/>
-              <w:rPr>
-                <w:bCs/>
-                <w:sz w:val="14"/>
-                <w:szCs w:val="14"/>
-              </w:rPr>
-            </w:pPr>
-          </w:p>
-          <w:p>
-            <w:pPr>
-              <w:pStyle w:val="Default"/>
-              <w:jc w:val="center"/>
-              <w:rPr>
-                <w:bCs/>
-                <w:sz w:val="14"/>
-                <w:szCs w:val="14"/>
-              </w:rPr>
-            </w:pPr>
-            <w:r>
-              <w:rPr>
-                <w:bCs/>
-                <w:sz w:val="14"/>
-                <w:szCs w:val="14"/>
-              </w:rPr>
-              <w:t>Microbial ID</w:t>
+            <w:r>
+              <w:t>Morphology Description</w:t>
             </w:r>
           </w:p>
         </w:tc>
@@ -12633,22 +12296,8 @@
             <w:vAlign w:val="center"/>
           </w:tcPr>
           <w:p>
-            <w:pPr>
-              <w:spacing w:line="360" w:lineRule="auto"/>
-              <w:jc w:val="center"/>
-              <w:rPr>
-                <w:rFonts w:ascii="Times New Roman" w:hAnsi="Times New Roman"/>
-                <w:sz w:val="14"/>
-                <w:szCs w:val="14"/>
-              </w:rPr>
-            </w:pPr>
-            <w:r>
-              <w:rPr>
-                <w:rFonts w:ascii="Times New Roman" w:hAnsi="Times New Roman"/>
-                <w:sz w:val="14"/>
-                <w:szCs w:val="14"/>
-              </w:rPr>
-              <w:t>{{ reader_name }}</w:t>
+            <w:r>
+              <w:t>{{ reading_name }}</w:t>
             </w:r>
           </w:p>
         </w:tc>

</xml_diff>